<commit_message>
assignment 3 almost done
</commit_message>
<xml_diff>
--- a/Workload-Distribution-using-CUDA-OpenCL/cuda-opencl-report.docx
+++ b/Workload-Distribution-using-CUDA-OpenCL/cuda-opencl-report.docx
@@ -1184,8 +1184,45 @@
     </w:p>
     <w:p>
       <w:pPr>
-        <w:pStyle w:val="2"/>
-        <w:jc w:val="center"/>
+        <w:pStyle w:val="a6"/>
+        <w:numPr>
+          <w:ilvl w:val="0"/>
+          <w:numId w:val="1"/>
+        </w:numPr>
+        <w:jc w:val="both"/>
+        <w:rPr>
+          <w:b/>
+          <w:bCs/>
+        </w:rPr>
+      </w:pPr>
+      <w:r>
+        <w:rPr>
+          <w:b/>
+          <w:bCs/>
+          <w:u w:val="single"/>
+        </w:rPr>
+        <w:t>GPU calculates everything</w:t>
+      </w:r>
+      <w:r>
+        <w:rPr>
+          <w:b/>
+          <w:bCs/>
+        </w:rPr>
+        <w:t xml:space="preserve"> and nothing is being operated on CPU.</w:t>
+      </w:r>
+      <w:r>
+        <w:rPr>
+          <w:b/>
+          <w:bCs/>
+        </w:rPr>
+        <w:t xml:space="preserve"> The code on every experiment gives the best and most productive results based on my hardware.</w:t>
+      </w:r>
+    </w:p>
+    <w:p>
+      <w:pPr>
+        <w:pStyle w:val="a6"/>
+        <w:ind w:left="1440"/>
+        <w:jc w:val="both"/>
       </w:pPr>
     </w:p>
     <w:p/>
@@ -1575,6 +1612,41 @@
       </w:r>
     </w:p>
     <w:p/>
+    <w:p/>
+    <w:p/>
+    <w:p/>
+    <w:p/>
+    <w:p/>
+    <w:p>
+      <w:pPr>
+        <w:rPr>
+          <w:b/>
+          <w:bCs/>
+        </w:rPr>
+      </w:pPr>
+      <w:r>
+        <w:rPr>
+          <w:b/>
+          <w:bCs/>
+        </w:rPr>
+        <w:lastRenderedPageBreak/>
+        <w:t>NOTES:</w:t>
+      </w:r>
+    </w:p>
+    <w:p>
+      <w:pPr>
+        <w:pStyle w:val="a6"/>
+        <w:numPr>
+          <w:ilvl w:val="0"/>
+          <w:numId w:val="2"/>
+        </w:numPr>
+        <w:jc w:val="both"/>
+      </w:pPr>
+      <w:r>
+        <w:t xml:space="preserve">Tests took place using different local work sizes (e.g. 32, 64, 128, 256) and there was no difference in which method was faster. As we can see, the N made that difference. Times were faster when local work size = 128 and local work size = 256. The tables above show the average times when local work size = 256. </w:t>
+      </w:r>
+    </w:p>
+    <w:p/>
     <w:p>
       <w:pPr>
         <w:jc w:val="center"/>
@@ -1583,7 +1655,6 @@
         <w:rPr>
           <w:noProof/>
         </w:rPr>
-        <w:lastRenderedPageBreak/>
         <w:drawing>
           <wp:inline distT="0" distB="0" distL="0" distR="0" wp14:anchorId="07E37199" wp14:editId="4AC4F8CA">
             <wp:extent cx="5274310" cy="2621280"/>
@@ -2051,7 +2122,11 @@
         <w:tab/>
       </w:r>
       <w:r>
-        <w:t xml:space="preserve">From the results for large N, it is observed that the execution time varies slightly across different block sizes. The best performance is achieved when block size = 512, with the lowest average execution time (0.0229). When block size = 32, it shows a significantly higher execution time (0.0461) because such a small block size fails to fully utilize the GPU's hardware resources, leaving computing units idle. On the other hand, for block sizes from 64 up to 512, the performance remains very stable and close to the optimal limit, proving that the GPU reaches its hardware </w:t>
+        <w:t xml:space="preserve">From the results for large N, it is observed that the execution time varies slightly across different block sizes. The best performance is achieved when block size = 512, with the lowest average execution time (0.0229). When block size = 32, it shows a </w:t>
+      </w:r>
+      <w:r>
+        <w:lastRenderedPageBreak/>
+        <w:t xml:space="preserve">significantly higher execution time (0.0461) because such a small block size fails to fully utilize the GPU's hardware resources, leaving computing units idle. On the other hand, for block sizes from 64 up to 512, the performance remains very stable and close to the optimal limit, proving that the GPU reaches its hardware </w:t>
       </w:r>
       <w:r>
         <w:t xml:space="preserve">limit </w:t>
@@ -2069,13 +2144,6 @@
         <w:t>.</w:t>
       </w:r>
     </w:p>
-    <w:p>
-      <w:pPr>
-        <w:jc w:val="both"/>
-      </w:pPr>
-    </w:p>
-    <w:p/>
-    <w:p/>
     <w:p/>
     <w:p/>
     <w:p>
@@ -2341,6 +2409,31 @@
     </w:p>
     <w:p>
       <w:pPr>
+        <w:pStyle w:val="a6"/>
+        <w:numPr>
+          <w:ilvl w:val="0"/>
+          <w:numId w:val="2"/>
+        </w:numPr>
+        <w:jc w:val="both"/>
+        <w:rPr>
+          <w:b/>
+          <w:bCs/>
+        </w:rPr>
+      </w:pPr>
+      <w:r>
+        <w:t xml:space="preserve">As I mentioned in the different workload distribution experiments, local work size = 256 and local work size = 128 give the best results in both cases of the workload distribution methods without having any major difference. Results are presented using 1 </w:t>
+      </w:r>
+      <w:proofErr w:type="spellStart"/>
+      <w:r>
+        <w:t>elem</w:t>
+      </w:r>
+      <w:proofErr w:type="spellEnd"/>
+      <w:r>
+        <w:t>/thread.</w:t>
+      </w:r>
+    </w:p>
+    <w:p>
+      <w:pPr>
         <w:ind w:firstLine="720"/>
         <w:jc w:val="both"/>
       </w:pPr>
@@ -2349,6 +2442,12 @@
       <w:pPr>
         <w:ind w:firstLine="720"/>
         <w:jc w:val="both"/>
+      </w:pPr>
+    </w:p>
+    <w:p>
+      <w:pPr>
+        <w:ind w:firstLine="720"/>
+        <w:jc w:val="center"/>
         <w:rPr>
           <w:lang w:val="el-GR"/>
         </w:rPr>
@@ -2359,9 +2458,9 @@
           <w:lang w:val="el-GR"/>
         </w:rPr>
         <w:drawing>
-          <wp:inline distT="0" distB="0" distL="0" distR="0" wp14:anchorId="34D277DA" wp14:editId="1C5071FC">
-            <wp:extent cx="4561368" cy="3892514"/>
-            <wp:effectExtent l="0" t="0" r="0" b="0"/>
+          <wp:inline distT="0" distB="0" distL="0" distR="0" wp14:anchorId="34D277DA" wp14:editId="5F03AAF4">
+            <wp:extent cx="3750328" cy="3200400"/>
+            <wp:effectExtent l="0" t="0" r="2540" b="0"/>
             <wp:docPr id="915387968" name="Εικόνα 1"/>
             <wp:cNvGraphicFramePr>
               <a:graphicFrameLocks xmlns:a="http://schemas.openxmlformats.org/drawingml/2006/main" noChangeAspect="1"/>
@@ -2382,7 +2481,7 @@
                   <pic:spPr>
                     <a:xfrm>
                       <a:off x="0" y="0"/>
-                      <a:ext cx="4566914" cy="3897247"/>
+                      <a:ext cx="3769641" cy="3216881"/>
                     </a:xfrm>
                     <a:prstGeom prst="rect">
                       <a:avLst/>
@@ -2507,11 +2606,10 @@
           <w:bCs/>
           <w:noProof/>
         </w:rPr>
-        <w:lastRenderedPageBreak/>
         <w:drawing>
-          <wp:inline distT="0" distB="0" distL="0" distR="0" wp14:anchorId="6F0C9A14" wp14:editId="517FE70D">
-            <wp:extent cx="4105848" cy="3343742"/>
-            <wp:effectExtent l="0" t="0" r="9525" b="9525"/>
+          <wp:inline distT="0" distB="0" distL="0" distR="0" wp14:anchorId="6F0C9A14" wp14:editId="763F92C3">
+            <wp:extent cx="3593804" cy="2926741"/>
+            <wp:effectExtent l="0" t="0" r="6985" b="6985"/>
             <wp:docPr id="1098774256" name="Εικόνα 1"/>
             <wp:cNvGraphicFramePr>
               <a:graphicFrameLocks xmlns:a="http://schemas.openxmlformats.org/drawingml/2006/main" noChangeAspect="1"/>
@@ -2532,7 +2630,7 @@
                   <pic:spPr>
                     <a:xfrm>
                       <a:off x="0" y="0"/>
-                      <a:ext cx="4105848" cy="3343742"/>
+                      <a:ext cx="3598131" cy="2930265"/>
                     </a:xfrm>
                     <a:prstGeom prst="rect">
                       <a:avLst/>
@@ -3198,11 +3296,9 @@
       <w:r>
         <w:t xml:space="preserve"> </w:t>
       </w:r>
-      <w:proofErr w:type="spellStart"/>
-      <w:r>
-        <w:t>approximently</w:t>
-      </w:r>
-      <w:proofErr w:type="spellEnd"/>
+      <w:r>
+        <w:t>approximately</w:t>
+      </w:r>
       <w:r>
         <w:t xml:space="preserve"> </w:t>
       </w:r>
@@ -3359,6 +3455,102 @@
         <w:t>larger N, this effect is reduced because the computation dominates the execution time, making the difference between the two cases less visible.</w:t>
       </w:r>
     </w:p>
+    <w:p>
+      <w:pPr>
+        <w:jc w:val="both"/>
+        <w:rPr>
+          <w:b/>
+          <w:bCs/>
+        </w:rPr>
+      </w:pPr>
+    </w:p>
+    <w:p>
+      <w:pPr>
+        <w:jc w:val="both"/>
+        <w:rPr>
+          <w:b/>
+          <w:bCs/>
+        </w:rPr>
+      </w:pPr>
+      <w:r>
+        <w:rPr>
+          <w:b/>
+          <w:bCs/>
+        </w:rPr>
+        <w:t>NOTE</w:t>
+      </w:r>
+      <w:r>
+        <w:rPr>
+          <w:b/>
+          <w:bCs/>
+        </w:rPr>
+        <w:t>S</w:t>
+      </w:r>
+      <w:r>
+        <w:rPr>
+          <w:b/>
+          <w:bCs/>
+        </w:rPr>
+        <w:t>:</w:t>
+      </w:r>
+    </w:p>
+    <w:p>
+      <w:pPr>
+        <w:pStyle w:val="a6"/>
+        <w:numPr>
+          <w:ilvl w:val="0"/>
+          <w:numId w:val="2"/>
+        </w:numPr>
+        <w:jc w:val="both"/>
+      </w:pPr>
+      <w:r>
+        <w:t>I tested both strategies of global barrier using it and without using it, on different local work sizes and I got the same results. The cases of 128 and 256 have by far the best results from the smaller local work sizes</w:t>
+      </w:r>
+      <w:r>
+        <w:t xml:space="preserve"> and the 512 cases</w:t>
+      </w:r>
+      <w:r>
+        <w:t xml:space="preserve">. On the other hand, I tested the algorithms on different workload distributions as well and again it doesn’t have the impact that N has on the algorithm.  For smaller N, 1 </w:t>
+      </w:r>
+      <w:proofErr w:type="spellStart"/>
+      <w:r>
+        <w:t>elem</w:t>
+      </w:r>
+      <w:proofErr w:type="spellEnd"/>
+      <w:r>
+        <w:t xml:space="preserve">/thread is by far faster where for bigger N the </w:t>
+      </w:r>
+      <w:proofErr w:type="spellStart"/>
+      <w:r>
+        <w:t>mult</w:t>
+      </w:r>
+      <w:proofErr w:type="spellEnd"/>
+      <w:r>
+        <w:t xml:space="preserve"> </w:t>
+      </w:r>
+      <w:proofErr w:type="spellStart"/>
+      <w:r>
+        <w:t>elem</w:t>
+      </w:r>
+      <w:proofErr w:type="spellEnd"/>
+      <w:r>
+        <w:t xml:space="preserve">/thread is much more productive. The results are presented with local work size = </w:t>
+      </w:r>
+      <w:r>
+        <w:t>256</w:t>
+      </w:r>
+      <w:r>
+        <w:t xml:space="preserve"> and with 1 </w:t>
+      </w:r>
+      <w:proofErr w:type="spellStart"/>
+      <w:r>
+        <w:t>elem</w:t>
+      </w:r>
+      <w:proofErr w:type="spellEnd"/>
+      <w:r>
+        <w:t>/thread.</w:t>
+      </w:r>
+    </w:p>
     <w:p/>
     <w:p/>
     <w:p>
@@ -3475,6 +3667,9 @@
         </w:tc>
       </w:tr>
       <w:tr>
+        <w:trPr>
+          <w:trHeight w:val="71"/>
+        </w:trPr>
         <w:tc>
           <w:tcPr>
             <w:tcW w:w="4148" w:type="dxa"/>
@@ -3491,7 +3686,7 @@
           </w:tcPr>
           <w:p>
             <w:r>
-              <w:t>0.0458887</w:t>
+              <w:t>0.0909231</w:t>
             </w:r>
           </w:p>
         </w:tc>
@@ -3513,7 +3708,7 @@
           </w:tcPr>
           <w:p>
             <w:r>
-              <w:t>0.0465289</w:t>
+              <w:t>0.0498088</w:t>
             </w:r>
           </w:p>
         </w:tc>
@@ -3535,7 +3730,7 @@
           </w:tcPr>
           <w:p>
             <w:r>
-              <w:t>0.0477389</w:t>
+              <w:t>0.0484792</w:t>
             </w:r>
           </w:p>
         </w:tc>
@@ -3553,122 +3748,172 @@
       <w:pPr>
         <w:jc w:val="both"/>
         <w:rPr>
+          <w:rFonts w:ascii="Arial" w:hAnsi="Arial" w:cs="Arial"/>
+        </w:rPr>
+      </w:pPr>
+      <w:r>
+        <w:rPr>
           <w:rFonts w:asciiTheme="minorHAnsi" w:hAnsiTheme="minorHAnsi"/>
         </w:rPr>
-      </w:pPr>
-      <w:r>
+        <w:tab/>
+      </w:r>
+      <w:r>
+        <w:rPr>
+          <w:rFonts w:ascii="Arial" w:hAnsi="Arial" w:cs="Arial"/>
+        </w:rPr>
+        <w:t xml:space="preserve">For large N, </w:t>
+      </w:r>
+      <w:r>
+        <w:rPr>
+          <w:rFonts w:ascii="Arial" w:hAnsi="Arial" w:cs="Arial"/>
+          <w:b/>
+          <w:bCs/>
+        </w:rPr>
+        <w:t>Shared Memory</w:t>
+      </w:r>
+      <w:r>
+        <w:rPr>
+          <w:rFonts w:ascii="Arial" w:hAnsi="Arial" w:cs="Arial"/>
+        </w:rPr>
+        <w:t xml:space="preserve"> is the fastes</w:t>
+      </w:r>
+      <w:r>
+        <w:rPr>
+          <w:rFonts w:ascii="Arial" w:hAnsi="Arial" w:cs="Arial"/>
+        </w:rPr>
+        <w:t xml:space="preserve">t </w:t>
+      </w:r>
+      <w:r>
+        <w:rPr>
+          <w:rFonts w:ascii="Arial" w:hAnsi="Arial" w:cs="Arial"/>
+        </w:rPr>
+        <w:t xml:space="preserve">because the heavy tree reduction happens inside the GPU's fast block memory and only one thread per block writes to </w:t>
+      </w:r>
+      <w:r>
+        <w:rPr>
+          <w:rFonts w:ascii="Arial" w:hAnsi="Arial" w:cs="Arial"/>
+        </w:rPr>
+        <w:lastRenderedPageBreak/>
+        <w:t xml:space="preserve">the main memory, minimizing data traffic. </w:t>
+      </w:r>
+      <w:r>
+        <w:rPr>
+          <w:rFonts w:ascii="Arial" w:hAnsi="Arial" w:cs="Arial"/>
+          <w:b/>
+          <w:bCs/>
+        </w:rPr>
+        <w:t>Global Memory</w:t>
+      </w:r>
+      <w:r>
+        <w:rPr>
+          <w:rFonts w:ascii="Arial" w:hAnsi="Arial" w:cs="Arial"/>
+        </w:rPr>
+        <w:t xml:space="preserve"> is almost identical </w:t>
+      </w:r>
+      <w:r>
+        <w:rPr>
+          <w:rFonts w:ascii="Arial" w:hAnsi="Arial" w:cs="Arial"/>
+        </w:rPr>
+        <w:t>in execution time</w:t>
+      </w:r>
+      <w:r>
+        <w:rPr>
+          <w:rFonts w:ascii="Arial" w:hAnsi="Arial" w:cs="Arial"/>
+        </w:rPr>
+        <w:t xml:space="preserve"> because threads read consecutive numbers, allowing the GPU to automatically group these reads together and load data in fast batches. On the other hand, </w:t>
+      </w:r>
+      <w:r>
+        <w:rPr>
+          <w:rFonts w:ascii="Arial" w:hAnsi="Arial" w:cs="Arial"/>
+          <w:b/>
+          <w:bCs/>
+        </w:rPr>
+        <w:t>Registers</w:t>
+      </w:r>
+      <w:r>
+        <w:rPr>
+          <w:rFonts w:ascii="Arial" w:hAnsi="Arial" w:cs="Arial"/>
+        </w:rPr>
+        <w:t xml:space="preserve"> are </w:t>
+      </w:r>
+      <w:r>
+        <w:rPr>
+          <w:rFonts w:ascii="Arial" w:hAnsi="Arial" w:cs="Arial"/>
+        </w:rPr>
+        <w:t xml:space="preserve">by far </w:t>
+      </w:r>
+      <w:r>
+        <w:rPr>
+          <w:rFonts w:ascii="Arial" w:hAnsi="Arial" w:cs="Arial"/>
+        </w:rPr>
+        <w:t>the slowest</w:t>
+      </w:r>
+      <w:r>
+        <w:rPr>
+          <w:rFonts w:ascii="Arial" w:hAnsi="Arial" w:cs="Arial"/>
+        </w:rPr>
+        <w:t>(</w:t>
+      </w:r>
+      <w:r>
+        <w:rPr>
+          <w:rFonts w:ascii="Arial" w:hAnsi="Arial" w:cs="Arial"/>
+          <w:b/>
+          <w:bCs/>
+        </w:rPr>
+        <w:t>nearly 2 times slower than the rest</w:t>
+      </w:r>
+      <w:r>
+        <w:rPr>
+          <w:rFonts w:ascii="Arial" w:hAnsi="Arial" w:cs="Arial"/>
+        </w:rPr>
+        <w:t>)</w:t>
+      </w:r>
+      <w:r>
+        <w:rPr>
+          <w:rFonts w:ascii="Arial" w:hAnsi="Arial" w:cs="Arial"/>
+        </w:rPr>
+        <w:t xml:space="preserve"> because they are strictly private to each thread since </w:t>
+      </w:r>
+      <w:r>
+        <w:rPr>
+          <w:rFonts w:ascii="Arial" w:hAnsi="Arial" w:cs="Arial"/>
+        </w:rPr>
+        <w:t>the</w:t>
+      </w:r>
+      <w:r>
+        <w:rPr>
+          <w:rFonts w:ascii="Arial" w:hAnsi="Arial" w:cs="Arial"/>
+        </w:rPr>
+        <w:t xml:space="preserve"> reduction loop requires threads to constantly share and exchange numbers, the GPU is forced to copy data out to the slow local memory so the threads can communicate, which creates severe delays.</w:t>
+      </w:r>
+    </w:p>
+    <w:p>
+      <w:pPr>
+        <w:jc w:val="both"/>
         <w:rPr>
           <w:rFonts w:asciiTheme="minorHAnsi" w:hAnsiTheme="minorHAnsi"/>
         </w:rPr>
-        <w:tab/>
-      </w:r>
-      <w:r>
+      </w:pPr>
+    </w:p>
+    <w:p>
+      <w:pPr>
         <w:rPr>
           <w:rFonts w:asciiTheme="minorHAnsi" w:hAnsiTheme="minorHAnsi"/>
         </w:rPr>
-        <w:t xml:space="preserve">For large N, all three memory models have almost the same execution times (between 0.045 and 0.047 seconds). The Registers case is slightly faster than the Global Memory case because it uses the GPU's fastest internal storage (registers). On the other hand, the Shared Memory model is slightly slower (0.0477 seconds). This happens because, with a huge workload of </w:t>
-      </w:r>
-      <m:oMath>
-        <m:sSup>
-          <m:sSupPr>
-            <m:ctrlPr>
-              <w:rPr>
-                <w:rFonts w:ascii="Cambria Math" w:hAnsi="Cambria Math"/>
-                <w:b/>
-                <w:bCs/>
-                <w:i/>
-              </w:rPr>
-            </m:ctrlPr>
-          </m:sSupPr>
-          <m:e>
-            <m:r>
-              <m:rPr>
-                <m:sty m:val="bi"/>
-              </m:rPr>
-              <w:rPr>
-                <w:rFonts w:ascii="Cambria Math" w:hAnsi="Cambria Math"/>
-              </w:rPr>
-              <m:t>10</m:t>
-            </m:r>
-          </m:e>
-          <m:sup>
-            <m:r>
-              <m:rPr>
-                <m:sty m:val="bi"/>
-              </m:rPr>
-              <w:rPr>
-                <w:rFonts w:ascii="Cambria Math" w:hAnsi="Cambria Math"/>
-              </w:rPr>
-              <m:t>8</m:t>
-            </m:r>
-          </m:sup>
-        </m:sSup>
-        <m:r>
-          <m:rPr>
-            <m:sty m:val="bi"/>
-          </m:rPr>
-          <w:rPr>
-            <w:rFonts w:ascii="Cambria Math" w:hAnsi="Cambria Math"/>
-          </w:rPr>
-          <m:t xml:space="preserve"> </m:t>
-        </m:r>
-      </m:oMath>
-      <w:r>
-        <w:rPr>
-          <w:rFonts w:asciiTheme="minorHAnsi" w:hAnsiTheme="minorHAnsi"/>
-        </w:rPr>
-        <w:t>elements, the threads must stop and wait for each other constantly using __</w:t>
-      </w:r>
-      <w:proofErr w:type="gramStart"/>
-      <w:r>
-        <w:rPr>
-          <w:rFonts w:asciiTheme="minorHAnsi" w:hAnsiTheme="minorHAnsi"/>
-        </w:rPr>
-        <w:t>syncthreads(</w:t>
-      </w:r>
-      <w:proofErr w:type="gramEnd"/>
-      <w:r>
-        <w:rPr>
-          <w:rFonts w:asciiTheme="minorHAnsi" w:hAnsiTheme="minorHAnsi"/>
-        </w:rPr>
-        <w:t>). This waiting time (synchronization overhead) creates small delays in the hardware, which wastes more time than what we save by using the fast shared memory.</w:t>
-      </w:r>
-    </w:p>
-    <w:p>
-      <w:pPr>
-        <w:jc w:val="both"/>
-        <w:rPr>
-          <w:rFonts w:asciiTheme="minorHAnsi" w:hAnsiTheme="minorHAnsi"/>
-        </w:rPr>
-      </w:pPr>
-    </w:p>
-    <w:p>
-      <w:pPr>
-        <w:rPr>
-          <w:rFonts w:asciiTheme="minorHAnsi" w:hAnsiTheme="minorHAnsi"/>
-        </w:rPr>
-      </w:pPr>
-    </w:p>
-    <w:p>
-      <w:pPr>
-        <w:rPr>
-          <w:rFonts w:asciiTheme="minorHAnsi" w:hAnsiTheme="minorHAnsi"/>
-        </w:rPr>
-      </w:pPr>
-    </w:p>
-    <w:p>
-      <w:pPr>
-        <w:rPr>
-          <w:b/>
-          <w:bCs/>
-        </w:rPr>
-      </w:pPr>
-      <w:r>
-        <w:rPr>
-          <w:b/>
-          <w:bCs/>
-        </w:rPr>
-        <w:lastRenderedPageBreak/>
+      </w:pPr>
+    </w:p>
+    <w:p>
+      <w:pPr>
+        <w:rPr>
+          <w:b/>
+          <w:bCs/>
+        </w:rPr>
+      </w:pPr>
+      <w:r>
+        <w:rPr>
+          <w:b/>
+          <w:bCs/>
+        </w:rPr>
         <w:t xml:space="preserve">N = </w:t>
       </w:r>
       <m:oMath>
@@ -3779,7 +4024,7 @@
           </w:tcPr>
           <w:p>
             <w:r>
-              <w:t>0.0003722</w:t>
+              <w:t>0.000503</w:t>
             </w:r>
           </w:p>
         </w:tc>
@@ -3801,7 +4046,7 @@
           </w:tcPr>
           <w:p>
             <w:r>
-              <w:t>0.0004093</w:t>
+              <w:t>0.0001633</w:t>
             </w:r>
           </w:p>
         </w:tc>
@@ -3823,7 +4068,7 @@
           </w:tcPr>
           <w:p>
             <w:r>
-              <w:t>0.0003613</w:t>
+              <w:t>0.0001437</w:t>
             </w:r>
           </w:p>
         </w:tc>
@@ -3839,22 +4084,190 @@
     <w:p>
       <w:pPr>
         <w:ind w:firstLine="720"/>
-      </w:pPr>
-      <w:r>
-        <w:t>For small N, the execution times are much lower because the workload is smaller. In this case, the Shared Memory model is the fastest (0.0003613 seconds). This happens because it does the heavy addition work inside the GPU's ultra-fast internal memory and writes only 1 final number per block to the main memory. On the other hand, the Registers and Global Memory cases are slightly slower because they don't do this internal reduction. Instead, they are forced to make many separate write operations directly to the main memory, which creates more data traffic and slows them down.</w:t>
-      </w:r>
+        <w:jc w:val="both"/>
+      </w:pPr>
+      <w:r>
+        <w:t xml:space="preserve">For small N, </w:t>
+      </w:r>
+      <w:r>
+        <w:t xml:space="preserve">execution times are much lower due to the smaller workload, with </w:t>
+      </w:r>
+      <w:r>
+        <w:rPr>
+          <w:b/>
+          <w:bCs/>
+        </w:rPr>
+        <w:t>Shared Memory</w:t>
+      </w:r>
+      <w:r>
+        <w:t xml:space="preserve"> remaining the fastest</w:t>
+      </w:r>
+      <w:r>
+        <w:t xml:space="preserve"> </w:t>
+      </w:r>
+      <w:r>
+        <w:t xml:space="preserve">and </w:t>
+      </w:r>
+      <w:r>
+        <w:rPr>
+          <w:b/>
+          <w:bCs/>
+        </w:rPr>
+        <w:t>Global Memory</w:t>
+      </w:r>
+      <w:r>
+        <w:t xml:space="preserve"> following closely</w:t>
+      </w:r>
+      <w:r>
+        <w:t xml:space="preserve">, </w:t>
+      </w:r>
+      <w:r>
+        <w:t xml:space="preserve">while </w:t>
+      </w:r>
+      <w:r>
+        <w:rPr>
+          <w:b/>
+          <w:bCs/>
+        </w:rPr>
+        <w:t>Registers</w:t>
+      </w:r>
+      <w:r>
+        <w:t xml:space="preserve"> are again </w:t>
+      </w:r>
+      <w:r>
+        <w:t xml:space="preserve">by far </w:t>
+      </w:r>
+      <w:r>
+        <w:t>the slowest</w:t>
+      </w:r>
+      <w:r>
+        <w:t>. In this case Registers are nearly 3.1 times slower than the other strategies.</w:t>
+      </w:r>
+      <w:r>
+        <w:t xml:space="preserve"> Shared Memory is the most efficient because the tree reduction happens entirely within the GPU's fast block memory, requiring only one global write per block. Global Memory performs nearly as fast because the GPU automatically merges the consecutive memory reads into quick batches which keeps the small workload efficient. On the other hand, Registers are the slowest because they are strictly private to each thread</w:t>
+      </w:r>
+      <w:r>
+        <w:t xml:space="preserve"> and</w:t>
+      </w:r>
+      <w:r>
+        <w:t xml:space="preserve"> since </w:t>
+      </w:r>
+      <w:r>
+        <w:t>the</w:t>
+      </w:r>
+      <w:r>
+        <w:t xml:space="preserve"> reduction loop forces threads to constantly share numbers, the GPU must waste time copying data out to the slow local memory so threads can communicate, which creates a huge overhead that slows down this small workload significantly.</w:t>
+      </w:r>
+    </w:p>
+    <w:p>
+      <w:pPr>
+        <w:ind w:firstLine="720"/>
+        <w:jc w:val="both"/>
+      </w:pPr>
+    </w:p>
+    <w:p>
+      <w:pPr>
+        <w:jc w:val="both"/>
+        <w:rPr>
+          <w:b/>
+          <w:bCs/>
+        </w:rPr>
+      </w:pPr>
+      <w:r>
+        <w:rPr>
+          <w:b/>
+          <w:bCs/>
+        </w:rPr>
+        <w:t>NOTES:</w:t>
+      </w:r>
+    </w:p>
+    <w:p>
+      <w:pPr>
+        <w:pStyle w:val="a6"/>
+        <w:numPr>
+          <w:ilvl w:val="0"/>
+          <w:numId w:val="2"/>
+        </w:numPr>
+        <w:jc w:val="both"/>
+      </w:pPr>
+      <w:r>
+        <w:t>I Tested every memory model algorithm with different block size, different workload distribution and different</w:t>
+      </w:r>
+      <w:r>
+        <w:t xml:space="preserve"> </w:t>
+      </w:r>
+      <w:r>
+        <w:t>barrier status and t</w:t>
+      </w:r>
+      <w:r>
+        <w:t>he main observation was that changing these secondary parameters had no significant impact on the relative performance</w:t>
+      </w:r>
+      <w:r>
+        <w:t>.</w:t>
+      </w:r>
+      <w:r>
+        <w:t xml:space="preserve"> Shared Memory consistently remained the fastest, followed by Global Memory, while Registers always performed the worst</w:t>
+      </w:r>
+      <w:r>
+        <w:t xml:space="preserve">. </w:t>
+      </w:r>
+      <w:r>
+        <w:t xml:space="preserve">Results are presented with block size = 256 with </w:t>
+      </w:r>
+      <w:proofErr w:type="gramStart"/>
+      <w:r>
+        <w:t>work load</w:t>
+      </w:r>
+      <w:proofErr w:type="gramEnd"/>
+      <w:r>
+        <w:t xml:space="preserve"> distribution of 1 </w:t>
+      </w:r>
+      <w:proofErr w:type="spellStart"/>
+      <w:r>
+        <w:t>elem</w:t>
+      </w:r>
+      <w:proofErr w:type="spellEnd"/>
+      <w:r>
+        <w:t>/thread and without the use of global barrier with __</w:t>
+      </w:r>
+      <w:proofErr w:type="spellStart"/>
+      <w:proofErr w:type="gramStart"/>
+      <w:r>
+        <w:t>syncthreads</w:t>
+      </w:r>
+      <w:proofErr w:type="spellEnd"/>
+      <w:r>
+        <w:t>(</w:t>
+      </w:r>
+      <w:proofErr w:type="gramEnd"/>
+      <w:r>
+        <w:t>)</w:t>
+      </w:r>
+      <w:r>
+        <w:t>.</w:t>
+      </w:r>
+    </w:p>
+    <w:p>
+      <w:pPr>
+        <w:pStyle w:val="a6"/>
+        <w:jc w:val="both"/>
+        <w:rPr>
+          <w:b/>
+          <w:bCs/>
+        </w:rPr>
+      </w:pPr>
     </w:p>
     <w:p/>
     <w:p>
-      <w:r>
-        <w:rPr>
-          <w:noProof/>
-        </w:rPr>
+      <w:pPr>
+        <w:jc w:val="center"/>
+      </w:pPr>
+      <w:r>
         <w:drawing>
-          <wp:inline distT="0" distB="0" distL="0" distR="0" wp14:anchorId="1BBF8CB1" wp14:editId="4C6414BA">
-            <wp:extent cx="5274310" cy="2442845"/>
-            <wp:effectExtent l="0" t="0" r="2540" b="0"/>
-            <wp:docPr id="711454503" name="Εικόνα 1"/>
+          <wp:inline distT="0" distB="0" distL="0" distR="0" wp14:anchorId="1121FF2D" wp14:editId="616AA766">
+            <wp:extent cx="3961234" cy="1861389"/>
+            <wp:effectExtent l="0" t="0" r="1270" b="5715"/>
+            <wp:docPr id="1702639650" name="Εικόνα 1"/>
             <wp:cNvGraphicFramePr>
               <a:graphicFrameLocks xmlns:a="http://schemas.openxmlformats.org/drawingml/2006/main" noChangeAspect="1"/>
             </wp:cNvGraphicFramePr>
@@ -3862,7 +4275,7 @@
               <a:graphicData uri="http://schemas.openxmlformats.org/drawingml/2006/picture">
                 <pic:pic xmlns:pic="http://schemas.openxmlformats.org/drawingml/2006/picture">
                   <pic:nvPicPr>
-                    <pic:cNvPr id="711454503" name=""/>
+                    <pic:cNvPr id="1702639650" name=""/>
                     <pic:cNvPicPr/>
                   </pic:nvPicPr>
                   <pic:blipFill>
@@ -3874,7 +4287,7 @@
                   <pic:spPr>
                     <a:xfrm>
                       <a:off x="0" y="0"/>
-                      <a:ext cx="5274310" cy="2442845"/>
+                      <a:ext cx="3962483" cy="1861976"/>
                     </a:xfrm>
                     <a:prstGeom prst="rect">
                       <a:avLst/>
@@ -3921,16 +4334,18 @@
     <w:p/>
     <w:p>
       <w:r>
+        <w:lastRenderedPageBreak/>
         <w:tab/>
-        <w:t xml:space="preserve">According to the graphs, it is also obvious that execution times do not differ that much across all different memory </w:t>
-      </w:r>
-      <w:proofErr w:type="gramStart"/>
-      <w:r>
-        <w:t>models .</w:t>
-      </w:r>
-      <w:proofErr w:type="gramEnd"/>
-      <w:r>
-        <w:t xml:space="preserve"> They are slightly less stable as N is lower. As a result, we can say that memory models’ execution times are more stable as N is getting larger</w:t>
+        <w:t xml:space="preserve">According to the graphs, it is also obvious that execution times </w:t>
+      </w:r>
+      <w:r>
+        <w:t xml:space="preserve">for Global and Shared do not differ much from each other whereas the productivity for Registers is very low as execution </w:t>
+      </w:r>
+      <w:r>
+        <w:t>times are</w:t>
+      </w:r>
+      <w:r>
+        <w:t xml:space="preserve"> way higher than the rest.</w:t>
       </w:r>
     </w:p>
     <w:p>
@@ -4202,10 +4617,186 @@
     </w:p>
     <w:p>
       <w:pPr>
+        <w:pStyle w:val="a6"/>
+        <w:numPr>
+          <w:ilvl w:val="0"/>
+          <w:numId w:val="2"/>
+        </w:numPr>
+        <w:jc w:val="both"/>
+        <w:rPr>
+          <w:b/>
+          <w:bCs/>
+        </w:rPr>
+      </w:pPr>
+      <w:r>
+        <w:t>My laptop’s GPU</w:t>
+      </w:r>
+      <w:r>
+        <w:t xml:space="preserve"> </w:t>
+      </w:r>
+      <w:r>
+        <w:t>has an upper constraint</w:t>
+      </w:r>
+      <w:r>
+        <w:t xml:space="preserve"> </w:t>
+      </w:r>
+      <w:r>
+        <w:t>of</w:t>
+      </w:r>
+      <w:r>
+        <w:t xml:space="preserve"> maximum work-group size of 256. </w:t>
+      </w:r>
+      <w:r>
+        <w:t>As a result</w:t>
+      </w:r>
+      <w:r>
+        <w:t xml:space="preserve">, any attempt to launch a kernel with a larger local work size violates the OpenCL execution constraints defined by </w:t>
+      </w:r>
+      <w:r>
+        <w:t>my</w:t>
+      </w:r>
+      <w:r>
+        <w:t xml:space="preserve"> hardware and is rejected by the runtime. Experiments with local work size = 512 are therefore not executable and are reported as </w:t>
+      </w:r>
+      <w:r>
+        <w:rPr>
+          <w:b/>
+          <w:bCs/>
+        </w:rPr>
+        <w:t>GPU LIMITATION ERROR</w:t>
+      </w:r>
+      <w:r>
+        <w:t xml:space="preserve"> in the experiment</w:t>
+      </w:r>
+      <w:r>
+        <w:t>s</w:t>
+      </w:r>
+      <w:r>
+        <w:t xml:space="preserve"> of </w:t>
+      </w:r>
+      <w:r>
+        <w:t>different local work sizes.</w:t>
+      </w:r>
+    </w:p>
+    <w:p>
+      <w:pPr>
+        <w:pStyle w:val="a6"/>
+        <w:rPr>
+          <w:b/>
+          <w:bCs/>
+        </w:rPr>
+      </w:pPr>
+    </w:p>
+    <w:p>
+      <w:pPr>
+        <w:ind w:left="360"/>
+        <w:jc w:val="center"/>
+        <w:rPr>
+          <w:b/>
+          <w:bCs/>
+        </w:rPr>
+      </w:pPr>
+      <w:r>
+        <w:rPr>
+          <w:b/>
+          <w:bCs/>
+        </w:rPr>
+        <w:drawing>
+          <wp:inline distT="0" distB="0" distL="0" distR="0" wp14:anchorId="2A6090CC" wp14:editId="0B59EBBF">
+            <wp:extent cx="2430738" cy="1638300"/>
+            <wp:effectExtent l="0" t="0" r="8255" b="0"/>
+            <wp:docPr id="75765010" name="Εικόνα 1"/>
+            <wp:cNvGraphicFramePr>
+              <a:graphicFrameLocks xmlns:a="http://schemas.openxmlformats.org/drawingml/2006/main" noChangeAspect="1"/>
+            </wp:cNvGraphicFramePr>
+            <a:graphic xmlns:a="http://schemas.openxmlformats.org/drawingml/2006/main">
+              <a:graphicData uri="http://schemas.openxmlformats.org/drawingml/2006/picture">
+                <pic:pic xmlns:pic="http://schemas.openxmlformats.org/drawingml/2006/picture">
+                  <pic:nvPicPr>
+                    <pic:cNvPr id="75765010" name=""/>
+                    <pic:cNvPicPr/>
+                  </pic:nvPicPr>
+                  <pic:blipFill>
+                    <a:blip r:embed="rId13"/>
+                    <a:stretch>
+                      <a:fillRect/>
+                    </a:stretch>
+                  </pic:blipFill>
+                  <pic:spPr>
+                    <a:xfrm>
+                      <a:off x="0" y="0"/>
+                      <a:ext cx="2438648" cy="1643631"/>
+                    </a:xfrm>
+                    <a:prstGeom prst="rect">
+                      <a:avLst/>
+                    </a:prstGeom>
+                  </pic:spPr>
+                </pic:pic>
+              </a:graphicData>
+            </a:graphic>
+          </wp:inline>
+        </w:drawing>
+      </w:r>
+    </w:p>
+    <w:p>
+      <w:pPr>
+        <w:pStyle w:val="a6"/>
+        <w:rPr>
+          <w:b/>
+          <w:bCs/>
+        </w:rPr>
+      </w:pPr>
+    </w:p>
+    <w:p>
+      <w:pPr>
+        <w:pStyle w:val="a6"/>
+        <w:numPr>
+          <w:ilvl w:val="0"/>
+          <w:numId w:val="2"/>
+        </w:numPr>
+        <w:jc w:val="both"/>
+        <w:rPr>
+          <w:b/>
+          <w:bCs/>
+        </w:rPr>
+      </w:pPr>
+      <w:r>
+        <w:rPr>
+          <w:b/>
+          <w:bCs/>
+          <w:u w:val="single"/>
+        </w:rPr>
+        <w:t>GPU calculates everything</w:t>
+      </w:r>
+      <w:r>
+        <w:rPr>
+          <w:b/>
+          <w:bCs/>
+        </w:rPr>
+        <w:t xml:space="preserve"> and nothing is being operated on CPU.</w:t>
+      </w:r>
+      <w:r>
+        <w:rPr>
+          <w:b/>
+          <w:bCs/>
+        </w:rPr>
+        <w:t xml:space="preserve"> The code on every experiment gives the best and most productive results based on my hardware.</w:t>
+      </w:r>
+    </w:p>
+    <w:p>
+      <w:pPr>
+        <w:pStyle w:val="a6"/>
+        <w:rPr>
+          <w:b/>
+          <w:bCs/>
+        </w:rPr>
+      </w:pPr>
+    </w:p>
+    <w:p>
+      <w:pPr>
         <w:pStyle w:val="2"/>
       </w:pPr>
       <w:r>
-        <w:lastRenderedPageBreak/>
         <w:t>Workload Distribution experiment</w:t>
       </w:r>
     </w:p>
@@ -4399,8 +4990,18 @@
         <w:t>4.285x</w:t>
       </w:r>
       <w:r>
-        <w:t>. This improvement occurs because each thread performs more useful computation, reducing thread management overhead and improving overall GPU utilization. As a result, computational resources are used more effectively, leading to better overall performance.</w:t>
-      </w:r>
+        <w:t xml:space="preserve">. This improvement occurs because each thread performs more useful computation, reducing thread management </w:t>
+      </w:r>
+      <w:r>
+        <w:lastRenderedPageBreak/>
+        <w:t>overhead and improving overall GPU utilization. As a result, computational resources are used more effectively, leading to better overall performance.</w:t>
+      </w:r>
+    </w:p>
+    <w:p>
+      <w:pPr>
+        <w:ind w:firstLine="720"/>
+        <w:jc w:val="both"/>
+      </w:pPr>
     </w:p>
     <w:p>
       <w:pPr>
@@ -4571,6 +5172,106 @@
       </w:r>
       <w:r>
         <w:t xml:space="preserve"> times faster than the other case. This is logical as with lower N the impact initializing the loop boundaries at every single iteration step has more impact as work is much less.</w:t>
+      </w:r>
+    </w:p>
+    <w:p>
+      <w:pPr>
+        <w:jc w:val="both"/>
+      </w:pPr>
+    </w:p>
+    <w:p>
+      <w:pPr>
+        <w:jc w:val="both"/>
+      </w:pPr>
+    </w:p>
+    <w:p>
+      <w:pPr>
+        <w:jc w:val="both"/>
+      </w:pPr>
+    </w:p>
+    <w:p>
+      <w:pPr>
+        <w:jc w:val="both"/>
+        <w:rPr>
+          <w:b/>
+          <w:bCs/>
+        </w:rPr>
+      </w:pPr>
+      <w:r>
+        <w:rPr>
+          <w:b/>
+          <w:bCs/>
+        </w:rPr>
+        <w:t>NOTE</w:t>
+      </w:r>
+      <w:r>
+        <w:rPr>
+          <w:b/>
+          <w:bCs/>
+        </w:rPr>
+        <w:t>S</w:t>
+      </w:r>
+      <w:r>
+        <w:rPr>
+          <w:b/>
+          <w:bCs/>
+        </w:rPr>
+        <w:t>:</w:t>
+      </w:r>
+    </w:p>
+    <w:p>
+      <w:pPr>
+        <w:pStyle w:val="a6"/>
+        <w:numPr>
+          <w:ilvl w:val="0"/>
+          <w:numId w:val="2"/>
+        </w:numPr>
+        <w:jc w:val="both"/>
+      </w:pPr>
+      <w:r>
+        <w:t xml:space="preserve">Tests took place using different </w:t>
+      </w:r>
+      <w:r>
+        <w:t xml:space="preserve">local work </w:t>
+      </w:r>
+      <w:r>
+        <w:t>sizes</w:t>
+      </w:r>
+      <w:r>
+        <w:t xml:space="preserve"> </w:t>
+      </w:r>
+      <w:r>
+        <w:t xml:space="preserve">(e.g. 32, 64, 128, 256) and there was no difference in which method was faster. </w:t>
+      </w:r>
+      <w:r>
+        <w:t>As we can see, the N made th</w:t>
+      </w:r>
+      <w:r>
+        <w:t>at</w:t>
+      </w:r>
+      <w:r>
+        <w:t xml:space="preserve"> difference. </w:t>
+      </w:r>
+      <w:r>
+        <w:t xml:space="preserve">Times were faster when </w:t>
+      </w:r>
+      <w:r>
+        <w:t xml:space="preserve">local work size </w:t>
+      </w:r>
+      <w:r>
+        <w:t xml:space="preserve">= 128 and </w:t>
+      </w:r>
+      <w:r>
+        <w:t>local work size</w:t>
+      </w:r>
+      <w:r>
+        <w:t xml:space="preserve"> = 256. The tables above show the average times when </w:t>
+      </w:r>
+      <w:r>
+        <w:t xml:space="preserve">local work size </w:t>
+      </w:r>
+      <w:r>
+        <w:t xml:space="preserve">= 256. </w:t>
       </w:r>
     </w:p>
     <w:p>
@@ -4599,7 +5300,7 @@
                     <pic:cNvPicPr/>
                   </pic:nvPicPr>
                   <pic:blipFill>
-                    <a:blip r:embed="rId13"/>
+                    <a:blip r:embed="rId14"/>
                     <a:stretch>
                       <a:fillRect/>
                     </a:stretch>
@@ -4813,6 +5514,7 @@
           </w:tcPr>
           <w:p>
             <w:r>
+              <w:lastRenderedPageBreak/>
               <w:t>128</w:t>
             </w:r>
           </w:p>
@@ -5031,6 +5733,11 @@
       <w:r>
         <w:t xml:space="preserve"> faster than the slowest case</w:t>
       </w:r>
+    </w:p>
+    <w:p>
+      <w:pPr>
+        <w:jc w:val="both"/>
+      </w:pPr>
     </w:p>
     <w:p/>
     <w:p>
@@ -5382,6 +6089,70 @@
     </w:p>
     <w:p>
       <w:pPr>
+        <w:jc w:val="both"/>
+        <w:rPr>
+          <w:b/>
+          <w:bCs/>
+        </w:rPr>
+      </w:pPr>
+      <w:r>
+        <w:rPr>
+          <w:b/>
+          <w:bCs/>
+        </w:rPr>
+        <w:t>NOTE</w:t>
+      </w:r>
+      <w:r>
+        <w:rPr>
+          <w:b/>
+          <w:bCs/>
+        </w:rPr>
+        <w:t>S</w:t>
+      </w:r>
+      <w:r>
+        <w:rPr>
+          <w:b/>
+          <w:bCs/>
+        </w:rPr>
+        <w:t>:</w:t>
+      </w:r>
+    </w:p>
+    <w:p>
+      <w:pPr>
+        <w:pStyle w:val="a6"/>
+        <w:numPr>
+          <w:ilvl w:val="0"/>
+          <w:numId w:val="2"/>
+        </w:numPr>
+        <w:jc w:val="both"/>
+        <w:rPr>
+          <w:b/>
+          <w:bCs/>
+        </w:rPr>
+      </w:pPr>
+      <w:r>
+        <w:t>As I mentioned in the different workload distribution experiments, local work size = 256 and local work size = 128 give the best results in both cases of the workload distribution methods</w:t>
+      </w:r>
+      <w:r>
+        <w:t xml:space="preserve"> without having any major difference.</w:t>
+      </w:r>
+      <w:r>
+        <w:t xml:space="preserve"> </w:t>
+      </w:r>
+      <w:r>
+        <w:t xml:space="preserve">Results are presented using 1 </w:t>
+      </w:r>
+      <w:proofErr w:type="spellStart"/>
+      <w:r>
+        <w:t>elem</w:t>
+      </w:r>
+      <w:proofErr w:type="spellEnd"/>
+      <w:r>
+        <w:t>/thread.</w:t>
+      </w:r>
+    </w:p>
+    <w:p>
+      <w:pPr>
         <w:jc w:val="center"/>
       </w:pPr>
       <w:r>
@@ -5389,9 +6160,9 @@
           <w:noProof/>
         </w:rPr>
         <w:drawing>
-          <wp:inline distT="0" distB="0" distL="0" distR="0" wp14:anchorId="2E45C2DF" wp14:editId="5C0BBB66">
-            <wp:extent cx="3721396" cy="3228108"/>
-            <wp:effectExtent l="0" t="0" r="0" b="0"/>
+          <wp:inline distT="0" distB="0" distL="0" distR="0" wp14:anchorId="2E45C2DF" wp14:editId="14906B50">
+            <wp:extent cx="2955851" cy="2564040"/>
+            <wp:effectExtent l="0" t="0" r="0" b="8255"/>
             <wp:docPr id="601886784" name="Εικόνα 1"/>
             <wp:cNvGraphicFramePr>
               <a:graphicFrameLocks xmlns:a="http://schemas.openxmlformats.org/drawingml/2006/main" noChangeAspect="1"/>
@@ -5404,7 +6175,7 @@
                     <pic:cNvPicPr/>
                   </pic:nvPicPr>
                   <pic:blipFill>
-                    <a:blip r:embed="rId14"/>
+                    <a:blip r:embed="rId15"/>
                     <a:stretch>
                       <a:fillRect/>
                     </a:stretch>
@@ -5412,7 +6183,7 @@
                   <pic:spPr>
                     <a:xfrm>
                       <a:off x="0" y="0"/>
-                      <a:ext cx="3730149" cy="3235701"/>
+                      <a:ext cx="2966893" cy="2573618"/>
                     </a:xfrm>
                     <a:prstGeom prst="rect">
                       <a:avLst/>
@@ -5439,7 +6210,6 @@
           <w:b/>
           <w:bCs/>
         </w:rPr>
-        <w:lastRenderedPageBreak/>
         <w:t xml:space="preserve">(Comparison between </w:t>
       </w:r>
       <w:r>
@@ -5526,9 +6296,9 @@
           <w:noProof/>
         </w:rPr>
         <w:drawing>
-          <wp:inline distT="0" distB="0" distL="0" distR="0" wp14:anchorId="72429FAD" wp14:editId="2425BB7A">
-            <wp:extent cx="3785191" cy="3137160"/>
-            <wp:effectExtent l="0" t="0" r="6350" b="6350"/>
+          <wp:inline distT="0" distB="0" distL="0" distR="0" wp14:anchorId="72429FAD" wp14:editId="2910C5EB">
+            <wp:extent cx="3285460" cy="2722984"/>
+            <wp:effectExtent l="0" t="0" r="0" b="1270"/>
             <wp:docPr id="1392499851" name="Εικόνα 1"/>
             <wp:cNvGraphicFramePr>
               <a:graphicFrameLocks xmlns:a="http://schemas.openxmlformats.org/drawingml/2006/main" noChangeAspect="1"/>
@@ -5541,7 +6311,7 @@
                     <pic:cNvPicPr/>
                   </pic:nvPicPr>
                   <pic:blipFill>
-                    <a:blip r:embed="rId15"/>
+                    <a:blip r:embed="rId16"/>
                     <a:stretch>
                       <a:fillRect/>
                     </a:stretch>
@@ -5549,7 +6319,7 @@
                   <pic:spPr>
                     <a:xfrm>
                       <a:off x="0" y="0"/>
-                      <a:ext cx="3789110" cy="3140408"/>
+                      <a:ext cx="3295239" cy="2731089"/>
                     </a:xfrm>
                     <a:prstGeom prst="rect">
                       <a:avLst/>
@@ -5689,11 +6459,6 @@
       <w:r>
         <w:t>.</w:t>
       </w:r>
-    </w:p>
-    <w:p>
-      <w:pPr>
-        <w:pStyle w:val="2"/>
-      </w:pPr>
     </w:p>
     <w:p>
       <w:pPr>
@@ -6000,7 +6765,6 @@
           </w:tcPr>
           <w:p>
             <w:r>
-              <w:lastRenderedPageBreak/>
               <w:t>Inactive</w:t>
             </w:r>
           </w:p>
@@ -6131,7 +6895,7 @@
                     <pic:cNvPicPr/>
                   </pic:nvPicPr>
                   <pic:blipFill>
-                    <a:blip r:embed="rId16"/>
+                    <a:blip r:embed="rId17"/>
                     <a:stretch>
                       <a:fillRect/>
                     </a:stretch>
@@ -6228,21 +6992,1160 @@
     </w:p>
     <w:p>
       <w:pPr>
+        <w:jc w:val="both"/>
+        <w:rPr>
+          <w:b/>
+          <w:bCs/>
+        </w:rPr>
+      </w:pPr>
+    </w:p>
+    <w:p>
+      <w:pPr>
+        <w:jc w:val="both"/>
+        <w:rPr>
+          <w:b/>
+          <w:bCs/>
+        </w:rPr>
+      </w:pPr>
+    </w:p>
+    <w:p>
+      <w:pPr>
+        <w:jc w:val="both"/>
+        <w:rPr>
+          <w:b/>
+          <w:bCs/>
+        </w:rPr>
+      </w:pPr>
+      <w:r>
+        <w:rPr>
+          <w:b/>
+          <w:bCs/>
+        </w:rPr>
+        <w:t>NOTE</w:t>
+      </w:r>
+      <w:r>
+        <w:rPr>
+          <w:b/>
+          <w:bCs/>
+        </w:rPr>
+        <w:t>S</w:t>
+      </w:r>
+      <w:r>
+        <w:rPr>
+          <w:b/>
+          <w:bCs/>
+        </w:rPr>
+        <w:t>:</w:t>
+      </w:r>
+    </w:p>
+    <w:p>
+      <w:pPr>
+        <w:pStyle w:val="a6"/>
+        <w:numPr>
+          <w:ilvl w:val="0"/>
+          <w:numId w:val="2"/>
+        </w:numPr>
+        <w:jc w:val="both"/>
+      </w:pPr>
+      <w:r>
+        <w:t>I tested both strategies of global barrier using it and without using it</w:t>
+      </w:r>
+      <w:r>
+        <w:t>,</w:t>
+      </w:r>
+      <w:r>
+        <w:t xml:space="preserve"> on different local work </w:t>
+      </w:r>
+      <w:r>
+        <w:t>sizes</w:t>
+      </w:r>
+      <w:r>
+        <w:t xml:space="preserve"> and I </w:t>
+      </w:r>
+      <w:r>
+        <w:t>got</w:t>
+      </w:r>
+      <w:r>
+        <w:t xml:space="preserve"> the same results</w:t>
+      </w:r>
+      <w:r>
+        <w:t>. T</w:t>
+      </w:r>
+      <w:r>
+        <w:t xml:space="preserve">he cases of 128 and 256 have by far the best results from the smaller </w:t>
+      </w:r>
+      <w:r>
+        <w:t>local work sizes</w:t>
+      </w:r>
+      <w:r>
+        <w:t>. On the other hand, I tested the algorithms on different workload distributions</w:t>
+      </w:r>
+      <w:r>
+        <w:t xml:space="preserve"> as well</w:t>
+      </w:r>
+      <w:r>
+        <w:t xml:space="preserve"> and again it doesn’t have the impact tha</w:t>
+      </w:r>
+      <w:r>
+        <w:t>t</w:t>
+      </w:r>
+      <w:r>
+        <w:t xml:space="preserve"> N has on the algorithm.  For smaller N</w:t>
+      </w:r>
+      <w:r>
+        <w:t>,</w:t>
+      </w:r>
+      <w:r>
+        <w:t xml:space="preserve"> 1 </w:t>
+      </w:r>
+      <w:proofErr w:type="spellStart"/>
+      <w:r>
+        <w:t>elem</w:t>
+      </w:r>
+      <w:proofErr w:type="spellEnd"/>
+      <w:r>
+        <w:t xml:space="preserve">/thread is by far faster </w:t>
+      </w:r>
+      <w:r>
+        <w:t>where</w:t>
+      </w:r>
+      <w:r>
+        <w:t xml:space="preserve"> for bigger N the </w:t>
+      </w:r>
+      <w:proofErr w:type="spellStart"/>
+      <w:r>
+        <w:t>mult</w:t>
+      </w:r>
+      <w:proofErr w:type="spellEnd"/>
+      <w:r>
+        <w:t xml:space="preserve"> </w:t>
+      </w:r>
+      <w:proofErr w:type="spellStart"/>
+      <w:r>
+        <w:t>elem</w:t>
+      </w:r>
+      <w:proofErr w:type="spellEnd"/>
+      <w:r>
+        <w:t xml:space="preserve">/thread is </w:t>
+      </w:r>
+      <w:r>
+        <w:t>much more productive.</w:t>
+      </w:r>
+      <w:r>
+        <w:t xml:space="preserve"> The results are presented with local work size = 128 and with 1 </w:t>
+      </w:r>
+      <w:proofErr w:type="spellStart"/>
+      <w:r>
+        <w:t>elem</w:t>
+      </w:r>
+      <w:proofErr w:type="spellEnd"/>
+      <w:r>
+        <w:t>/thread</w:t>
+      </w:r>
+      <w:r>
+        <w:t>.</w:t>
+      </w:r>
+    </w:p>
+    <w:p/>
+    <w:p/>
+    <w:p>
+      <w:pPr>
         <w:pStyle w:val="2"/>
-      </w:pPr>
-    </w:p>
-    <w:p>
-      <w:pPr>
-        <w:pStyle w:val="2"/>
+        <w:rPr>
+          <w:lang w:val="el-GR"/>
+        </w:rPr>
       </w:pPr>
       <w:r>
         <w:t>Different Memory Models</w:t>
       </w:r>
     </w:p>
+    <w:p>
+      <w:pPr>
+        <w:rPr>
+          <w:lang w:val="el-GR"/>
+        </w:rPr>
+      </w:pPr>
+    </w:p>
+    <w:p>
+      <w:pPr>
+        <w:rPr>
+          <w:b/>
+          <w:bCs/>
+        </w:rPr>
+      </w:pPr>
+      <w:r>
+        <w:rPr>
+          <w:b/>
+          <w:bCs/>
+        </w:rPr>
+        <w:t xml:space="preserve">N = </w:t>
+      </w:r>
+      <m:oMath>
+        <m:sSup>
+          <m:sSupPr>
+            <m:ctrlPr>
+              <w:rPr>
+                <w:rFonts w:ascii="Cambria Math" w:hAnsi="Cambria Math"/>
+                <w:b/>
+                <w:bCs/>
+                <w:i/>
+              </w:rPr>
+            </m:ctrlPr>
+          </m:sSupPr>
+          <m:e>
+            <m:r>
+              <m:rPr>
+                <m:sty m:val="bi"/>
+              </m:rPr>
+              <w:rPr>
+                <w:rFonts w:ascii="Cambria Math" w:hAnsi="Cambria Math"/>
+              </w:rPr>
+              <m:t>10</m:t>
+            </m:r>
+          </m:e>
+          <m:sup>
+            <m:r>
+              <m:rPr>
+                <m:sty m:val="bi"/>
+              </m:rPr>
+              <w:rPr>
+                <w:rFonts w:ascii="Cambria Math" w:hAnsi="Cambria Math"/>
+              </w:rPr>
+              <m:t>8</m:t>
+            </m:r>
+          </m:sup>
+        </m:sSup>
+      </m:oMath>
+    </w:p>
+    <w:p>
+      <w:pPr>
+        <w:rPr>
+          <w:b/>
+          <w:bCs/>
+        </w:rPr>
+      </w:pPr>
+      <w:r>
+        <w:rPr>
+          <w:b/>
+          <w:bCs/>
+        </w:rPr>
+        <w:t>Result = 333.333</w:t>
+      </w:r>
+    </w:p>
+    <w:p>
+      <w:pPr>
+        <w:rPr>
+          <w:lang w:val="el-GR"/>
+        </w:rPr>
+      </w:pPr>
+    </w:p>
+    <w:tbl>
+      <w:tblPr>
+        <w:tblStyle w:val="ac"/>
+        <w:tblW w:w="0" w:type="auto"/>
+        <w:tblLook w:val="04A0" w:firstRow="1" w:lastRow="0" w:firstColumn="1" w:lastColumn="0" w:noHBand="0" w:noVBand="1"/>
+      </w:tblPr>
+      <w:tblGrid>
+        <w:gridCol w:w="4148"/>
+        <w:gridCol w:w="4148"/>
+      </w:tblGrid>
+      <w:tr>
+        <w:tc>
+          <w:tcPr>
+            <w:tcW w:w="4148" w:type="dxa"/>
+          </w:tcPr>
+          <w:p>
+            <w:r>
+              <w:t>Memory Model</w:t>
+            </w:r>
+          </w:p>
+        </w:tc>
+        <w:tc>
+          <w:tcPr>
+            <w:tcW w:w="4148" w:type="dxa"/>
+          </w:tcPr>
+          <w:p>
+            <w:r>
+              <w:t>Avg Time of Execution</w:t>
+            </w:r>
+          </w:p>
+        </w:tc>
+      </w:tr>
+      <w:tr>
+        <w:trPr>
+          <w:trHeight w:val="71"/>
+        </w:trPr>
+        <w:tc>
+          <w:tcPr>
+            <w:tcW w:w="4148" w:type="dxa"/>
+          </w:tcPr>
+          <w:p>
+            <w:r>
+              <w:t>Registers</w:t>
+            </w:r>
+          </w:p>
+        </w:tc>
+        <w:tc>
+          <w:tcPr>
+            <w:tcW w:w="4148" w:type="dxa"/>
+          </w:tcPr>
+          <w:p>
+            <w:r>
+              <w:t>0.0052498</w:t>
+            </w:r>
+          </w:p>
+        </w:tc>
+      </w:tr>
+      <w:tr>
+        <w:tc>
+          <w:tcPr>
+            <w:tcW w:w="4148" w:type="dxa"/>
+          </w:tcPr>
+          <w:p>
+            <w:r>
+              <w:t>Global</w:t>
+            </w:r>
+          </w:p>
+        </w:tc>
+        <w:tc>
+          <w:tcPr>
+            <w:tcW w:w="4148" w:type="dxa"/>
+          </w:tcPr>
+          <w:p>
+            <w:r>
+              <w:t>0.0022735</w:t>
+            </w:r>
+          </w:p>
+        </w:tc>
+      </w:tr>
+      <w:tr>
+        <w:tc>
+          <w:tcPr>
+            <w:tcW w:w="4148" w:type="dxa"/>
+          </w:tcPr>
+          <w:p>
+            <w:r>
+              <w:t>Shared</w:t>
+            </w:r>
+          </w:p>
+        </w:tc>
+        <w:tc>
+          <w:tcPr>
+            <w:tcW w:w="4148" w:type="dxa"/>
+          </w:tcPr>
+          <w:p>
+            <w:r>
+              <w:t>0.0021948</w:t>
+            </w:r>
+          </w:p>
+        </w:tc>
+      </w:tr>
+    </w:tbl>
     <w:p/>
     <w:p>
       <w:pPr>
+        <w:rPr>
+          <w:lang w:val="el-GR"/>
+        </w:rPr>
+      </w:pPr>
+    </w:p>
+    <w:p>
+      <w:pPr>
         <w:jc w:val="both"/>
+        <w:rPr>
+          <w:rFonts w:ascii="Arial" w:hAnsi="Arial" w:cs="Arial"/>
+        </w:rPr>
+      </w:pPr>
+      <w:r>
+        <w:rPr>
+          <w:rFonts w:asciiTheme="minorHAnsi" w:hAnsiTheme="minorHAnsi"/>
+        </w:rPr>
+        <w:tab/>
+      </w:r>
+      <w:r>
+        <w:rPr>
+          <w:rFonts w:ascii="Arial" w:hAnsi="Arial" w:cs="Arial"/>
+        </w:rPr>
+        <w:t xml:space="preserve">For large N, </w:t>
+      </w:r>
+      <w:r>
+        <w:rPr>
+          <w:rFonts w:ascii="Arial" w:hAnsi="Arial" w:cs="Arial"/>
+          <w:b/>
+          <w:bCs/>
+        </w:rPr>
+        <w:t>Shared Memory</w:t>
+      </w:r>
+      <w:r>
+        <w:rPr>
+          <w:rFonts w:ascii="Arial" w:hAnsi="Arial" w:cs="Arial"/>
+        </w:rPr>
+        <w:t xml:space="preserve"> is the fastest because the heavy tree reduction happens inside the GPU's fast block memory and only one thread per block writes to the main memory, minimizing data traffic. </w:t>
+      </w:r>
+      <w:r>
+        <w:rPr>
+          <w:rFonts w:ascii="Arial" w:hAnsi="Arial" w:cs="Arial"/>
+          <w:b/>
+          <w:bCs/>
+        </w:rPr>
+        <w:t>Global Memory</w:t>
+      </w:r>
+      <w:r>
+        <w:rPr>
+          <w:rFonts w:ascii="Arial" w:hAnsi="Arial" w:cs="Arial"/>
+        </w:rPr>
+        <w:t xml:space="preserve"> is almost identical in </w:t>
+      </w:r>
+      <w:r>
+        <w:rPr>
+          <w:rFonts w:ascii="Arial" w:hAnsi="Arial" w:cs="Arial"/>
+        </w:rPr>
+        <w:lastRenderedPageBreak/>
+        <w:t xml:space="preserve">execution time because threads read consecutive numbers, allowing the GPU to automatically group these reads together and load data in fast batches. On the other hand, </w:t>
+      </w:r>
+      <w:r>
+        <w:rPr>
+          <w:rFonts w:ascii="Arial" w:hAnsi="Arial" w:cs="Arial"/>
+          <w:b/>
+          <w:bCs/>
+        </w:rPr>
+        <w:t>Registers</w:t>
+      </w:r>
+      <w:r>
+        <w:rPr>
+          <w:rFonts w:ascii="Arial" w:hAnsi="Arial" w:cs="Arial"/>
+        </w:rPr>
+        <w:t xml:space="preserve"> are by far the slowest(</w:t>
+      </w:r>
+      <w:r>
+        <w:rPr>
+          <w:rFonts w:ascii="Arial" w:hAnsi="Arial" w:cs="Arial"/>
+          <w:b/>
+          <w:bCs/>
+        </w:rPr>
+        <w:t>nearly 2 times slower than the rest</w:t>
+      </w:r>
+      <w:r>
+        <w:rPr>
+          <w:rFonts w:ascii="Arial" w:hAnsi="Arial" w:cs="Arial"/>
+        </w:rPr>
+        <w:t>) because they are strictly private to each thread since the reduction loop requires threads to constantly share and exchange numbers, the GPU is forced to copy data out to the slow local memory so the threads can communicate, which creates severe delays.</w:t>
+      </w:r>
+    </w:p>
+    <w:p>
+      <w:pPr>
+        <w:jc w:val="both"/>
+        <w:rPr>
+          <w:rFonts w:asciiTheme="minorHAnsi" w:hAnsiTheme="minorHAnsi"/>
+        </w:rPr>
+      </w:pPr>
+    </w:p>
+    <w:p>
+      <w:pPr>
+        <w:rPr>
+          <w:rFonts w:asciiTheme="minorHAnsi" w:hAnsiTheme="minorHAnsi"/>
+        </w:rPr>
+      </w:pPr>
+    </w:p>
+    <w:p>
+      <w:pPr>
+        <w:rPr>
+          <w:b/>
+          <w:bCs/>
+        </w:rPr>
+      </w:pPr>
+      <w:r>
+        <w:rPr>
+          <w:b/>
+          <w:bCs/>
+        </w:rPr>
+        <w:t xml:space="preserve">N = </w:t>
+      </w:r>
+      <m:oMath>
+        <m:sSup>
+          <m:sSupPr>
+            <m:ctrlPr>
+              <w:rPr>
+                <w:rFonts w:ascii="Cambria Math" w:hAnsi="Cambria Math"/>
+                <w:b/>
+                <w:bCs/>
+                <w:i/>
+              </w:rPr>
+            </m:ctrlPr>
+          </m:sSupPr>
+          <m:e>
+            <m:r>
+              <m:rPr>
+                <m:sty m:val="bi"/>
+              </m:rPr>
+              <w:rPr>
+                <w:rFonts w:ascii="Cambria Math" w:hAnsi="Cambria Math"/>
+              </w:rPr>
+              <m:t>10</m:t>
+            </m:r>
+          </m:e>
+          <m:sup>
+            <m:r>
+              <m:rPr>
+                <m:sty m:val="bi"/>
+              </m:rPr>
+              <w:rPr>
+                <w:rFonts w:ascii="Cambria Math" w:hAnsi="Cambria Math"/>
+              </w:rPr>
+              <m:t>5</m:t>
+            </m:r>
+          </m:sup>
+        </m:sSup>
+      </m:oMath>
+    </w:p>
+    <w:p>
+      <w:pPr>
+        <w:rPr>
+          <w:b/>
+          <w:bCs/>
+        </w:rPr>
+      </w:pPr>
+      <w:r>
+        <w:rPr>
+          <w:b/>
+          <w:bCs/>
+        </w:rPr>
+        <w:t>Result = 333.333</w:t>
+      </w:r>
+    </w:p>
+    <w:p>
+      <w:pPr>
+        <w:rPr>
+          <w:lang w:val="el-GR"/>
+        </w:rPr>
+      </w:pPr>
+    </w:p>
+    <w:tbl>
+      <w:tblPr>
+        <w:tblStyle w:val="ac"/>
+        <w:tblW w:w="0" w:type="auto"/>
+        <w:tblLook w:val="04A0" w:firstRow="1" w:lastRow="0" w:firstColumn="1" w:lastColumn="0" w:noHBand="0" w:noVBand="1"/>
+      </w:tblPr>
+      <w:tblGrid>
+        <w:gridCol w:w="4148"/>
+        <w:gridCol w:w="4148"/>
+      </w:tblGrid>
+      <w:tr>
+        <w:tc>
+          <w:tcPr>
+            <w:tcW w:w="4148" w:type="dxa"/>
+          </w:tcPr>
+          <w:p>
+            <w:r>
+              <w:t>Memory Model</w:t>
+            </w:r>
+          </w:p>
+        </w:tc>
+        <w:tc>
+          <w:tcPr>
+            <w:tcW w:w="4148" w:type="dxa"/>
+          </w:tcPr>
+          <w:p>
+            <w:r>
+              <w:t>Avg Time of Execution</w:t>
+            </w:r>
+          </w:p>
+        </w:tc>
+      </w:tr>
+      <w:tr>
+        <w:tc>
+          <w:tcPr>
+            <w:tcW w:w="4148" w:type="dxa"/>
+          </w:tcPr>
+          <w:p>
+            <w:r>
+              <w:t>Registers</w:t>
+            </w:r>
+          </w:p>
+        </w:tc>
+        <w:tc>
+          <w:tcPr>
+            <w:tcW w:w="4148" w:type="dxa"/>
+          </w:tcPr>
+          <w:p>
+            <w:r>
+              <w:t>0.0027583</w:t>
+            </w:r>
+          </w:p>
+        </w:tc>
+      </w:tr>
+      <w:tr>
+        <w:tc>
+          <w:tcPr>
+            <w:tcW w:w="4148" w:type="dxa"/>
+          </w:tcPr>
+          <w:p>
+            <w:r>
+              <w:t>Global</w:t>
+            </w:r>
+          </w:p>
+        </w:tc>
+        <w:tc>
+          <w:tcPr>
+            <w:tcW w:w="4148" w:type="dxa"/>
+          </w:tcPr>
+          <w:p>
+            <w:r>
+              <w:t>0.00074</w:t>
+            </w:r>
+          </w:p>
+        </w:tc>
+      </w:tr>
+      <w:tr>
+        <w:tc>
+          <w:tcPr>
+            <w:tcW w:w="4148" w:type="dxa"/>
+          </w:tcPr>
+          <w:p>
+            <w:r>
+              <w:t>Shared</w:t>
+            </w:r>
+          </w:p>
+        </w:tc>
+        <w:tc>
+          <w:tcPr>
+            <w:tcW w:w="4148" w:type="dxa"/>
+          </w:tcPr>
+          <w:p>
+            <w:r>
+              <w:t>0.0006353</w:t>
+            </w:r>
+          </w:p>
+        </w:tc>
+      </w:tr>
+    </w:tbl>
+    <w:p>
+      <w:pPr>
+        <w:rPr>
+          <w:lang w:val="el-GR"/>
+        </w:rPr>
+      </w:pPr>
+    </w:p>
+    <w:p>
+      <w:pPr>
+        <w:ind w:firstLine="720"/>
+        <w:jc w:val="both"/>
+      </w:pPr>
+      <w:r>
+        <w:t xml:space="preserve">For small N, </w:t>
+      </w:r>
+      <w:r>
+        <w:t xml:space="preserve">execution times are much lower due to the smaller workload, with </w:t>
+      </w:r>
+      <w:r>
+        <w:rPr>
+          <w:b/>
+          <w:bCs/>
+        </w:rPr>
+        <w:t>Shared Memory</w:t>
+      </w:r>
+      <w:r>
+        <w:t xml:space="preserve"> remaining the fastest</w:t>
+      </w:r>
+      <w:r>
+        <w:t xml:space="preserve"> </w:t>
+      </w:r>
+      <w:r>
+        <w:t xml:space="preserve">and </w:t>
+      </w:r>
+      <w:r>
+        <w:rPr>
+          <w:b/>
+          <w:bCs/>
+        </w:rPr>
+        <w:t>Global Memory</w:t>
+      </w:r>
+      <w:r>
+        <w:t xml:space="preserve"> following closely</w:t>
+      </w:r>
+      <w:r>
+        <w:t xml:space="preserve">, </w:t>
+      </w:r>
+      <w:r>
+        <w:t xml:space="preserve">while </w:t>
+      </w:r>
+      <w:r>
+        <w:rPr>
+          <w:b/>
+          <w:bCs/>
+        </w:rPr>
+        <w:t>Registers</w:t>
+      </w:r>
+      <w:r>
+        <w:t xml:space="preserve"> are again </w:t>
+      </w:r>
+      <w:r>
+        <w:t xml:space="preserve">by far </w:t>
+      </w:r>
+      <w:r>
+        <w:t>the slowest</w:t>
+      </w:r>
+      <w:r>
+        <w:t>. In this case Registers are nearly 3.1 times slower than the other strategies.</w:t>
+      </w:r>
+      <w:r>
+        <w:t xml:space="preserve"> Shared Memory is the most efficient because the tree reduction happens entirely within the GPU's fast block memory, requiring only one global write per block. Global Memory performs nearly as fast because the GPU automatically merges the consecutive memory reads into quick batches which keeps the small workload efficient. On the other hand, Registers are the slowest because they are strictly private to each thread</w:t>
+      </w:r>
+      <w:r>
+        <w:t xml:space="preserve"> and</w:t>
+      </w:r>
+      <w:r>
+        <w:t xml:space="preserve"> since </w:t>
+      </w:r>
+      <w:r>
+        <w:t>the</w:t>
+      </w:r>
+      <w:r>
+        <w:t xml:space="preserve"> reduction loop forces threads to constantly share numbers, the GPU must waste time copying data out to the slow local memory so threads can communicate, which creates a huge overhead that slows down this small workload significantly.</w:t>
+      </w:r>
+    </w:p>
+    <w:p>
+      <w:pPr>
+        <w:ind w:firstLine="720"/>
+        <w:jc w:val="both"/>
+      </w:pPr>
+    </w:p>
+    <w:p>
+      <w:pPr>
+        <w:jc w:val="both"/>
+        <w:rPr>
+          <w:b/>
+          <w:bCs/>
+        </w:rPr>
+      </w:pPr>
+      <w:r>
+        <w:rPr>
+          <w:b/>
+          <w:bCs/>
+        </w:rPr>
+        <w:t>NOTES:</w:t>
+      </w:r>
+    </w:p>
+    <w:p>
+      <w:pPr>
+        <w:pStyle w:val="a6"/>
+        <w:numPr>
+          <w:ilvl w:val="0"/>
+          <w:numId w:val="2"/>
+        </w:numPr>
+        <w:jc w:val="both"/>
+      </w:pPr>
+      <w:r>
+        <w:t>I Tested every memory model algorithm with different block size, different workload distribution and different barrier status and t</w:t>
+      </w:r>
+      <w:r>
+        <w:t>he main observation was that changing these secondary parameters had no significant impact on the relative performance. Shared Memory consistently remained the fastest, followed by Global Memory, while Registers always performed the worst</w:t>
+      </w:r>
+      <w:r>
+        <w:t xml:space="preserve">. </w:t>
+      </w:r>
+      <w:r>
+        <w:t xml:space="preserve">Results are presented with </w:t>
+      </w:r>
+      <w:r>
+        <w:t>local work size</w:t>
+      </w:r>
+      <w:r>
+        <w:t xml:space="preserve"> = 256 with </w:t>
+      </w:r>
+      <w:r>
+        <w:t>workload</w:t>
+      </w:r>
+      <w:r>
+        <w:t xml:space="preserve"> distribution of 1 </w:t>
+      </w:r>
+      <w:proofErr w:type="spellStart"/>
+      <w:r>
+        <w:t>elem</w:t>
+      </w:r>
+      <w:proofErr w:type="spellEnd"/>
+      <w:r>
+        <w:t>/thread and with the use of global barrier</w:t>
+      </w:r>
+      <w:r>
+        <w:t>.</w:t>
+      </w:r>
+    </w:p>
+    <w:p>
+      <w:pPr>
+        <w:pStyle w:val="a6"/>
+        <w:jc w:val="both"/>
+        <w:rPr>
+          <w:b/>
+          <w:bCs/>
+        </w:rPr>
+      </w:pPr>
+    </w:p>
+    <w:p/>
+    <w:p>
+      <w:pPr>
+        <w:jc w:val="center"/>
+      </w:pPr>
+      <w:r>
+        <w:drawing>
+          <wp:inline distT="0" distB="0" distL="0" distR="0" wp14:anchorId="5F39CAD0" wp14:editId="6CE9EA38">
+            <wp:extent cx="5274310" cy="2303145"/>
+            <wp:effectExtent l="0" t="0" r="2540" b="1905"/>
+            <wp:docPr id="641496951" name="Εικόνα 1"/>
+            <wp:cNvGraphicFramePr>
+              <a:graphicFrameLocks xmlns:a="http://schemas.openxmlformats.org/drawingml/2006/main" noChangeAspect="1"/>
+            </wp:cNvGraphicFramePr>
+            <a:graphic xmlns:a="http://schemas.openxmlformats.org/drawingml/2006/main">
+              <a:graphicData uri="http://schemas.openxmlformats.org/drawingml/2006/picture">
+                <pic:pic xmlns:pic="http://schemas.openxmlformats.org/drawingml/2006/picture">
+                  <pic:nvPicPr>
+                    <pic:cNvPr id="641496951" name=""/>
+                    <pic:cNvPicPr/>
+                  </pic:nvPicPr>
+                  <pic:blipFill>
+                    <a:blip r:embed="rId18"/>
+                    <a:stretch>
+                      <a:fillRect/>
+                    </a:stretch>
+                  </pic:blipFill>
+                  <pic:spPr>
+                    <a:xfrm>
+                      <a:off x="0" y="0"/>
+                      <a:ext cx="5274310" cy="2303145"/>
+                    </a:xfrm>
+                    <a:prstGeom prst="rect">
+                      <a:avLst/>
+                    </a:prstGeom>
+                  </pic:spPr>
+                </pic:pic>
+              </a:graphicData>
+            </a:graphic>
+          </wp:inline>
+        </w:drawing>
+      </w:r>
+    </w:p>
+    <w:p/>
+    <w:p>
+      <w:pPr>
+        <w:jc w:val="center"/>
+        <w:rPr>
+          <w:b/>
+          <w:bCs/>
+        </w:rPr>
+      </w:pPr>
+      <w:r>
+        <w:rPr>
+          <w:b/>
+          <w:bCs/>
+        </w:rPr>
+        <w:lastRenderedPageBreak/>
+        <w:t xml:space="preserve">(Comparison between </w:t>
+      </w:r>
+      <w:r>
+        <w:rPr>
+          <w:b/>
+          <w:bCs/>
+        </w:rPr>
+        <w:t>memory models</w:t>
+      </w:r>
+      <w:r>
+        <w:rPr>
+          <w:b/>
+          <w:bCs/>
+        </w:rPr>
+        <w:t xml:space="preserve"> for different N)</w:t>
+      </w:r>
+    </w:p>
+    <w:p/>
+    <w:p>
+      <w:r>
+        <w:tab/>
+        <w:t>According to the graphs, it is also obvious that execution times for Global and Shared do not differ much from each other whereas the productivity for Registers is very low as execution times are way higher than the rest.</w:t>
+      </w:r>
+      <w:r>
+        <w:t xml:space="preserve"> </w:t>
+      </w:r>
+    </w:p>
+    <w:p>
+      <w:pPr>
+        <w:jc w:val="both"/>
+        <w:rPr>
+          <w:lang w:val="el-GR"/>
+        </w:rPr>
+      </w:pPr>
+    </w:p>
+    <w:p>
+      <w:pPr>
+        <w:pStyle w:val="1"/>
+      </w:pPr>
+      <w:r>
+        <w:t>pthreads Vs OpenMP Vs CUDA Vs OpenCL</w:t>
+      </w:r>
+    </w:p>
+    <w:p>
+      <w:pPr>
+        <w:jc w:val="both"/>
+      </w:pPr>
+      <w:r>
+        <w:t xml:space="preserve">According to all my assignments the fastest methods on </w:t>
+      </w:r>
+      <w:r>
+        <w:rPr>
+          <w:b/>
+          <w:bCs/>
+        </w:rPr>
+        <w:t xml:space="preserve">N = 1000000 for f(x) = </w:t>
+      </w:r>
+      <m:oMath>
+        <m:sSup>
+          <m:sSupPr>
+            <m:ctrlPr>
+              <w:rPr>
+                <w:rFonts w:ascii="Cambria Math" w:hAnsi="Cambria Math"/>
+                <w:b/>
+                <w:bCs/>
+                <w:i/>
+              </w:rPr>
+            </m:ctrlPr>
+          </m:sSupPr>
+          <m:e>
+            <m:r>
+              <m:rPr>
+                <m:sty m:val="bi"/>
+              </m:rPr>
+              <w:rPr>
+                <w:rFonts w:ascii="Cambria Math" w:hAnsi="Cambria Math"/>
+              </w:rPr>
+              <m:t>x</m:t>
+            </m:r>
+          </m:e>
+          <m:sup>
+            <m:r>
+              <m:rPr>
+                <m:sty m:val="bi"/>
+              </m:rPr>
+              <w:rPr>
+                <w:rFonts w:ascii="Cambria Math" w:hAnsi="Cambria Math"/>
+              </w:rPr>
+              <m:t>2</m:t>
+            </m:r>
+          </m:sup>
+        </m:sSup>
+      </m:oMath>
+      <w:r>
+        <w:t xml:space="preserve"> were </w:t>
+      </w:r>
+    </w:p>
+    <w:p>
+      <w:pPr>
+        <w:pStyle w:val="a6"/>
+        <w:numPr>
+          <w:ilvl w:val="0"/>
+          <w:numId w:val="2"/>
+        </w:numPr>
+        <w:jc w:val="both"/>
+      </w:pPr>
+      <w:r>
+        <w:t xml:space="preserve">For </w:t>
+      </w:r>
+      <w:r>
+        <w:rPr>
+          <w:b/>
+          <w:bCs/>
+          <w:u w:val="single"/>
+        </w:rPr>
+        <w:t>OpenMP</w:t>
+      </w:r>
+      <w:r>
+        <w:t xml:space="preserve"> was Guided Routing with </w:t>
+      </w:r>
+      <w:r>
+        <w:rPr>
+          <w:b/>
+          <w:bCs/>
+        </w:rPr>
+        <w:t>execution time = 0.</w:t>
+      </w:r>
+      <w:r>
+        <w:rPr>
+          <w:b/>
+          <w:bCs/>
+        </w:rPr>
+        <w:t>119524</w:t>
+      </w:r>
+    </w:p>
+    <w:p>
+      <w:pPr>
+        <w:pStyle w:val="a6"/>
+        <w:numPr>
+          <w:ilvl w:val="0"/>
+          <w:numId w:val="2"/>
+        </w:numPr>
+        <w:jc w:val="both"/>
+      </w:pPr>
+      <w:r>
+        <w:t xml:space="preserve">For </w:t>
+      </w:r>
+      <w:r>
+        <w:rPr>
+          <w:b/>
+          <w:bCs/>
+          <w:u w:val="single"/>
+        </w:rPr>
+        <w:t xml:space="preserve">pthreads </w:t>
+      </w:r>
+      <w:r>
+        <w:t xml:space="preserve">was Cyclic Scheduling with </w:t>
+      </w:r>
+      <w:r>
+        <w:rPr>
+          <w:b/>
+          <w:bCs/>
+        </w:rPr>
+        <w:t xml:space="preserve">execution time = </w:t>
+      </w:r>
+      <w:r>
+        <w:rPr>
+          <w:b/>
+          <w:bCs/>
+        </w:rPr>
+        <w:t>0.0760965</w:t>
+      </w:r>
+      <w:r>
+        <w:t>.</w:t>
+      </w:r>
+    </w:p>
+    <w:p>
+      <w:pPr>
+        <w:ind w:left="720"/>
+        <w:jc w:val="both"/>
+      </w:pPr>
+      <w:r>
+        <w:t xml:space="preserve">For </w:t>
+      </w:r>
+      <w:r>
+        <w:rPr>
+          <w:b/>
+          <w:bCs/>
+          <w:u w:val="single"/>
+        </w:rPr>
+        <w:t>CUDA</w:t>
+      </w:r>
+      <w:r>
+        <w:rPr>
+          <w:b/>
+          <w:bCs/>
+          <w:u w:val="single"/>
+        </w:rPr>
+        <w:t xml:space="preserve"> </w:t>
+      </w:r>
+      <w:r>
+        <w:t>was when using Multiple</w:t>
+      </w:r>
+      <w:r>
+        <w:t xml:space="preserve"> elements per thread</w:t>
+      </w:r>
+      <w:r>
+        <w:t xml:space="preserve"> with block size = 512, without using a global barrier and with the global memory model with </w:t>
+      </w:r>
+      <w:r>
+        <w:rPr>
+          <w:b/>
+          <w:bCs/>
+        </w:rPr>
+        <w:t xml:space="preserve">execution time = </w:t>
+      </w:r>
+      <w:r>
+        <w:rPr>
+          <w:b/>
+          <w:bCs/>
+        </w:rPr>
+        <w:t>0.0229351</w:t>
+      </w:r>
+    </w:p>
+    <w:p>
+      <w:pPr>
+        <w:pStyle w:val="a6"/>
+        <w:numPr>
+          <w:ilvl w:val="0"/>
+          <w:numId w:val="2"/>
+        </w:numPr>
+        <w:jc w:val="both"/>
+      </w:pPr>
+      <w:r>
+        <w:t xml:space="preserve">For </w:t>
+      </w:r>
+      <w:r>
+        <w:rPr>
+          <w:b/>
+          <w:bCs/>
+          <w:u w:val="single"/>
+        </w:rPr>
+        <w:t>OpenCL</w:t>
+      </w:r>
+      <w:r>
+        <w:rPr>
+          <w:b/>
+          <w:bCs/>
+          <w:u w:val="single"/>
+        </w:rPr>
+        <w:t xml:space="preserve"> </w:t>
+      </w:r>
+      <w:r>
+        <w:t>was when using shared memory model with block size = 256 with global barrier</w:t>
+      </w:r>
+      <w:r>
+        <w:t xml:space="preserve"> with </w:t>
+      </w:r>
+      <w:r>
+        <w:rPr>
+          <w:b/>
+          <w:bCs/>
+        </w:rPr>
+        <w:t xml:space="preserve">execution time = </w:t>
+      </w:r>
+      <w:r>
+        <w:rPr>
+          <w:b/>
+          <w:bCs/>
+        </w:rPr>
+        <w:t>0.0021948</w:t>
+      </w:r>
+    </w:p>
+    <w:p/>
+    <w:p>
+      <w:pPr>
+        <w:jc w:val="both"/>
+      </w:pPr>
+      <w:r>
+        <w:t xml:space="preserve">It is observable that OpenCL with these hyperparameters is the most productive way of calculating this integration. </w:t>
+      </w:r>
+      <w:r>
+        <w:t>S</w:t>
+      </w:r>
+      <w:r>
+        <w:t xml:space="preserve">econd </w:t>
+      </w:r>
+      <w:r>
+        <w:t xml:space="preserve">best </w:t>
+      </w:r>
+      <w:r>
+        <w:t>is the CUDA implementation. This is e</w:t>
+      </w:r>
+      <w:r>
+        <w:t>xpected</w:t>
+      </w:r>
+      <w:r>
+        <w:t xml:space="preserve"> as these algorithms operate on GPU whereas the other implementations are working on CPU.</w:t>
+      </w:r>
+    </w:p>
+    <w:p>
+      <w:pPr>
+        <w:jc w:val="both"/>
+        <w:rPr>
+          <w:b/>
+          <w:bCs/>
+        </w:rPr>
       </w:pPr>
     </w:p>
     <w:sectPr>
@@ -6260,7 +8163,7 @@
   <w:abstractNum w:abstractNumId="0" w15:restartNumberingAfterBreak="0">
     <w:nsid w:val="10720B2C"/>
     <w:multiLevelType w:val="hybridMultilevel"/>
-    <w:tmpl w:val="70606FF0"/>
+    <w:tmpl w:val="697AF56E"/>
     <w:lvl w:ilvl="0" w:tplc="04080001">
       <w:start w:val="1"/>
       <w:numFmt w:val="bullet"/>
@@ -7107,7 +9010,6 @@
   <w:style w:type="character" w:default="1" w:styleId="a0">
     <w:name w:val="Default Paragraph Font"/>
     <w:uiPriority w:val="1"/>
-    <w:semiHidden/>
     <w:unhideWhenUsed/>
   </w:style>
   <w:style w:type="table" w:default="1" w:styleId="a1">

</xml_diff>